<commit_message>
Began audio management; work on troll's quiz
</commit_message>
<xml_diff>
--- a/quiz.docx
+++ b/quiz.docx
@@ -73,7 +73,7 @@
         </w:numPr>
         <w:rPr>
           <w:rFonts w:asciiTheme="minorHAnsi" w:hAnsiTheme="minorHAnsi" w:cstheme="minorHAnsi"/>
-          <w:lang w:val="en-GB"/>
+          <w:lang w:val="pl-PL"/>
         </w:rPr>
       </w:pPr>
       <w:r>
@@ -105,51 +105,30 @@
           <w:lang w:val="en-GB"/>
         </w:rPr>
         <w:br/>
-        <w:t xml:space="preserve">A) </w:t>
-      </w:r>
-      <w:proofErr w:type="spellStart"/>
-      <w:r>
-        <w:rPr>
-          <w:rFonts w:asciiTheme="minorHAnsi" w:hAnsiTheme="minorHAnsi" w:cstheme="minorHAnsi"/>
-          <w:lang w:val="en-GB"/>
-        </w:rPr>
-        <w:t>ogień</w:t>
-      </w:r>
-      <w:proofErr w:type="spellEnd"/>
-      <w:r>
-        <w:rPr>
-          <w:rFonts w:asciiTheme="minorHAnsi" w:hAnsiTheme="minorHAnsi" w:cstheme="minorHAnsi"/>
-          <w:lang w:val="en-GB"/>
-        </w:rPr>
-        <w:br/>
-        <w:t xml:space="preserve">B) </w:t>
-      </w:r>
-      <w:proofErr w:type="spellStart"/>
-      <w:r>
-        <w:rPr>
-          <w:rFonts w:asciiTheme="minorHAnsi" w:hAnsiTheme="minorHAnsi" w:cstheme="minorHAnsi"/>
-          <w:lang w:val="en-GB"/>
-        </w:rPr>
-        <w:t>woda</w:t>
-      </w:r>
-      <w:proofErr w:type="spellEnd"/>
-      <w:r>
-        <w:rPr>
-          <w:rFonts w:asciiTheme="minorHAnsi" w:hAnsiTheme="minorHAnsi" w:cstheme="minorHAnsi"/>
-          <w:lang w:val="en-GB"/>
-        </w:rPr>
-        <w:br/>
-        <w:t xml:space="preserve">C) </w:t>
-      </w:r>
-      <w:proofErr w:type="spellStart"/>
-      <w:r>
-        <w:rPr>
-          <w:rFonts w:asciiTheme="minorHAnsi" w:hAnsiTheme="minorHAnsi" w:cstheme="minorHAnsi"/>
-          <w:lang w:val="en-GB"/>
-        </w:rPr>
-        <w:t>chleb</w:t>
-      </w:r>
-      <w:proofErr w:type="spellEnd"/>
+      </w:r>
+      <w:r>
+        <w:rPr>
+          <w:rFonts w:asciiTheme="minorHAnsi" w:hAnsiTheme="minorHAnsi" w:cstheme="minorHAnsi"/>
+          <w:lang w:val="pl-PL"/>
+        </w:rPr>
+        <w:t>A) ogień</w:t>
+      </w:r>
+      <w:r>
+        <w:rPr>
+          <w:rFonts w:asciiTheme="minorHAnsi" w:hAnsiTheme="minorHAnsi" w:cstheme="minorHAnsi"/>
+          <w:lang w:val="pl-PL"/>
+        </w:rPr>
+        <w:br/>
+        <w:t>B) woda</w:t>
+      </w:r>
+      <w:r>
+        <w:rPr>
+          <w:rFonts w:asciiTheme="minorHAnsi" w:hAnsiTheme="minorHAnsi" w:cstheme="minorHAnsi"/>
+          <w:lang w:val="pl-PL"/>
+        </w:rPr>
+        <w:br/>
+        <w:t>C) chleb</w:t>
+      </w:r>
     </w:p>
     <w:p>
       <w:pPr>
@@ -160,7 +139,7 @@
         </w:numPr>
         <w:rPr>
           <w:rFonts w:asciiTheme="minorHAnsi" w:hAnsiTheme="minorHAnsi" w:cstheme="minorHAnsi"/>
-          <w:lang w:val="en-GB"/>
+          <w:lang w:val="pl-PL"/>
         </w:rPr>
       </w:pPr>
       <w:r>
@@ -192,51 +171,30 @@
           <w:lang w:val="en-GB"/>
         </w:rPr>
         <w:br/>
-        <w:t xml:space="preserve">A) </w:t>
-      </w:r>
-      <w:proofErr w:type="spellStart"/>
-      <w:r>
-        <w:rPr>
-          <w:rFonts w:asciiTheme="minorHAnsi" w:hAnsiTheme="minorHAnsi" w:cstheme="minorHAnsi"/>
-          <w:lang w:val="en-GB"/>
-        </w:rPr>
-        <w:t>przyjaciel</w:t>
-      </w:r>
-      <w:proofErr w:type="spellEnd"/>
-      <w:r>
-        <w:rPr>
-          <w:rFonts w:asciiTheme="minorHAnsi" w:hAnsiTheme="minorHAnsi" w:cstheme="minorHAnsi"/>
-          <w:lang w:val="en-GB"/>
-        </w:rPr>
-        <w:br/>
-        <w:t xml:space="preserve">B) </w:t>
-      </w:r>
-      <w:proofErr w:type="spellStart"/>
-      <w:r>
-        <w:rPr>
-          <w:rFonts w:asciiTheme="minorHAnsi" w:hAnsiTheme="minorHAnsi" w:cstheme="minorHAnsi"/>
-          <w:lang w:val="en-GB"/>
-        </w:rPr>
-        <w:t>nauczyciel</w:t>
-      </w:r>
-      <w:proofErr w:type="spellEnd"/>
-      <w:r>
-        <w:rPr>
-          <w:rFonts w:asciiTheme="minorHAnsi" w:hAnsiTheme="minorHAnsi" w:cstheme="minorHAnsi"/>
-          <w:lang w:val="en-GB"/>
-        </w:rPr>
-        <w:br/>
-        <w:t xml:space="preserve">C) </w:t>
-      </w:r>
-      <w:proofErr w:type="spellStart"/>
-      <w:r>
-        <w:rPr>
-          <w:rFonts w:asciiTheme="minorHAnsi" w:hAnsiTheme="minorHAnsi" w:cstheme="minorHAnsi"/>
-          <w:lang w:val="en-GB"/>
-        </w:rPr>
-        <w:t>lekarz</w:t>
-      </w:r>
-      <w:proofErr w:type="spellEnd"/>
+      </w:r>
+      <w:r>
+        <w:rPr>
+          <w:rFonts w:asciiTheme="minorHAnsi" w:hAnsiTheme="minorHAnsi" w:cstheme="minorHAnsi"/>
+          <w:lang w:val="pl-PL"/>
+        </w:rPr>
+        <w:t>A) przyjaciel</w:t>
+      </w:r>
+      <w:r>
+        <w:rPr>
+          <w:rFonts w:asciiTheme="minorHAnsi" w:hAnsiTheme="minorHAnsi" w:cstheme="minorHAnsi"/>
+          <w:lang w:val="pl-PL"/>
+        </w:rPr>
+        <w:br/>
+        <w:t>B) nauczyciel</w:t>
+      </w:r>
+      <w:r>
+        <w:rPr>
+          <w:rFonts w:asciiTheme="minorHAnsi" w:hAnsiTheme="minorHAnsi" w:cstheme="minorHAnsi"/>
+          <w:lang w:val="pl-PL"/>
+        </w:rPr>
+        <w:br/>
+        <w:t>C) lekarz</w:t>
+      </w:r>
     </w:p>
     <w:p>
       <w:pPr>
@@ -371,7 +329,7 @@
         </w:numPr>
         <w:rPr>
           <w:rFonts w:asciiTheme="minorHAnsi" w:hAnsiTheme="minorHAnsi" w:cstheme="minorHAnsi"/>
-          <w:lang w:val="en-GB"/>
+          <w:lang w:val="pl-PL"/>
         </w:rPr>
       </w:pPr>
       <w:r>
@@ -403,51 +361,30 @@
           <w:lang w:val="en-GB"/>
         </w:rPr>
         <w:br/>
-        <w:t xml:space="preserve">A) </w:t>
-      </w:r>
-      <w:proofErr w:type="spellStart"/>
-      <w:r>
-        <w:rPr>
-          <w:rFonts w:asciiTheme="minorHAnsi" w:hAnsiTheme="minorHAnsi" w:cstheme="minorHAnsi"/>
-          <w:lang w:val="en-GB"/>
-        </w:rPr>
-        <w:t>księżyc</w:t>
-      </w:r>
-      <w:proofErr w:type="spellEnd"/>
-      <w:r>
-        <w:rPr>
-          <w:rFonts w:asciiTheme="minorHAnsi" w:hAnsiTheme="minorHAnsi" w:cstheme="minorHAnsi"/>
-          <w:lang w:val="en-GB"/>
-        </w:rPr>
-        <w:br/>
-        <w:t xml:space="preserve">B) </w:t>
-      </w:r>
-      <w:proofErr w:type="spellStart"/>
-      <w:r>
-        <w:rPr>
-          <w:rFonts w:asciiTheme="minorHAnsi" w:hAnsiTheme="minorHAnsi" w:cstheme="minorHAnsi"/>
-          <w:lang w:val="en-GB"/>
-        </w:rPr>
-        <w:t>gwiazda</w:t>
-      </w:r>
-      <w:proofErr w:type="spellEnd"/>
-      <w:r>
-        <w:rPr>
-          <w:rFonts w:asciiTheme="minorHAnsi" w:hAnsiTheme="minorHAnsi" w:cstheme="minorHAnsi"/>
-          <w:lang w:val="en-GB"/>
-        </w:rPr>
-        <w:br/>
-        <w:t xml:space="preserve">C) </w:t>
-      </w:r>
-      <w:proofErr w:type="spellStart"/>
-      <w:r>
-        <w:rPr>
-          <w:rFonts w:asciiTheme="minorHAnsi" w:hAnsiTheme="minorHAnsi" w:cstheme="minorHAnsi"/>
-          <w:lang w:val="en-GB"/>
-        </w:rPr>
-        <w:t>słońce</w:t>
-      </w:r>
-      <w:proofErr w:type="spellEnd"/>
+      </w:r>
+      <w:r>
+        <w:rPr>
+          <w:rFonts w:asciiTheme="minorHAnsi" w:hAnsiTheme="minorHAnsi" w:cstheme="minorHAnsi"/>
+          <w:lang w:val="pl-PL"/>
+        </w:rPr>
+        <w:t>A) księżyc</w:t>
+      </w:r>
+      <w:r>
+        <w:rPr>
+          <w:rFonts w:asciiTheme="minorHAnsi" w:hAnsiTheme="minorHAnsi" w:cstheme="minorHAnsi"/>
+          <w:lang w:val="pl-PL"/>
+        </w:rPr>
+        <w:br/>
+        <w:t>B) gwiazda</w:t>
+      </w:r>
+      <w:r>
+        <w:rPr>
+          <w:rFonts w:asciiTheme="minorHAnsi" w:hAnsiTheme="minorHAnsi" w:cstheme="minorHAnsi"/>
+          <w:lang w:val="pl-PL"/>
+        </w:rPr>
+        <w:br/>
+        <w:t>C) słońce</w:t>
+      </w:r>
     </w:p>
     <w:p>
       <w:pPr>
@@ -600,15 +537,13 @@
         <w:t>okno</w:t>
       </w:r>
       <w:proofErr w:type="spellEnd"/>
-      <w:proofErr w:type="gramStart"/>
-      <w:r>
-        <w:rPr>
-          <w:rFonts w:asciiTheme="minorHAnsi" w:hAnsiTheme="minorHAnsi" w:cstheme="minorHAnsi"/>
-          <w:lang w:val="en-GB"/>
-        </w:rPr>
-        <w:t>” ?</w:t>
-      </w:r>
-      <w:proofErr w:type="gramEnd"/>
+      <w:r>
+        <w:rPr>
+          <w:rFonts w:asciiTheme="minorHAnsi" w:hAnsiTheme="minorHAnsi" w:cstheme="minorHAnsi"/>
+          <w:lang w:val="en-GB"/>
+        </w:rPr>
+        <w:t>”?</w:t>
+      </w:r>
       <w:r>
         <w:rPr>
           <w:rFonts w:asciiTheme="minorHAnsi" w:hAnsiTheme="minorHAnsi" w:cstheme="minorHAnsi"/>
@@ -646,7 +581,7 @@
         </w:numPr>
         <w:rPr>
           <w:rFonts w:asciiTheme="minorHAnsi" w:hAnsiTheme="minorHAnsi" w:cstheme="minorHAnsi"/>
-          <w:lang w:val="en-GB"/>
+          <w:lang w:val="pl-PL"/>
         </w:rPr>
       </w:pPr>
       <w:r>
@@ -678,51 +613,30 @@
           <w:lang w:val="en-GB"/>
         </w:rPr>
         <w:br/>
-        <w:t xml:space="preserve">A) </w:t>
-      </w:r>
-      <w:proofErr w:type="spellStart"/>
-      <w:r>
-        <w:rPr>
-          <w:rFonts w:asciiTheme="minorHAnsi" w:hAnsiTheme="minorHAnsi" w:cstheme="minorHAnsi"/>
-          <w:lang w:val="en-GB"/>
-        </w:rPr>
-        <w:t>szkoła</w:t>
-      </w:r>
-      <w:proofErr w:type="spellEnd"/>
-      <w:r>
-        <w:rPr>
-          <w:rFonts w:asciiTheme="minorHAnsi" w:hAnsiTheme="minorHAnsi" w:cstheme="minorHAnsi"/>
-          <w:lang w:val="en-GB"/>
-        </w:rPr>
-        <w:br/>
-        <w:t xml:space="preserve">B) </w:t>
-      </w:r>
-      <w:proofErr w:type="spellStart"/>
-      <w:r>
-        <w:rPr>
-          <w:rFonts w:asciiTheme="minorHAnsi" w:hAnsiTheme="minorHAnsi" w:cstheme="minorHAnsi"/>
-          <w:lang w:val="en-GB"/>
-        </w:rPr>
-        <w:t>jedzenie</w:t>
-      </w:r>
-      <w:proofErr w:type="spellEnd"/>
-      <w:r>
-        <w:rPr>
-          <w:rFonts w:asciiTheme="minorHAnsi" w:hAnsiTheme="minorHAnsi" w:cstheme="minorHAnsi"/>
-          <w:lang w:val="en-GB"/>
-        </w:rPr>
-        <w:br/>
-        <w:t xml:space="preserve">C) </w:t>
-      </w:r>
-      <w:proofErr w:type="spellStart"/>
-      <w:r>
-        <w:rPr>
-          <w:rFonts w:asciiTheme="minorHAnsi" w:hAnsiTheme="minorHAnsi" w:cstheme="minorHAnsi"/>
-          <w:lang w:val="en-GB"/>
-        </w:rPr>
-        <w:t>rodzina</w:t>
-      </w:r>
-      <w:proofErr w:type="spellEnd"/>
+      </w:r>
+      <w:r>
+        <w:rPr>
+          <w:rFonts w:asciiTheme="minorHAnsi" w:hAnsiTheme="minorHAnsi" w:cstheme="minorHAnsi"/>
+          <w:lang w:val="pl-PL"/>
+        </w:rPr>
+        <w:t>A) szkoła</w:t>
+      </w:r>
+      <w:r>
+        <w:rPr>
+          <w:rFonts w:asciiTheme="minorHAnsi" w:hAnsiTheme="minorHAnsi" w:cstheme="minorHAnsi"/>
+          <w:lang w:val="pl-PL"/>
+        </w:rPr>
+        <w:br/>
+        <w:t>B) jedzenie</w:t>
+      </w:r>
+      <w:r>
+        <w:rPr>
+          <w:rFonts w:asciiTheme="minorHAnsi" w:hAnsiTheme="minorHAnsi" w:cstheme="minorHAnsi"/>
+          <w:lang w:val="pl-PL"/>
+        </w:rPr>
+        <w:br/>
+        <w:t>C) rodzina</w:t>
+      </w:r>
     </w:p>
     <w:sectPr>
       <w:pgSz w:w="11906" w:h="16838"/>

</xml_diff>